<commit_message>
Short newsletter: Word line and paragraph spacing match the preview
Co-Authored-By: Claude Opus 5.5 (1M context) <noreply@anthropic.com>
Claude-Session: https://claude.ai/code/session_01SwzMZLFMBNgZe6RPr5GkX9
</commit_message>
<xml_diff>
--- a/backend/app/assets/template_onepager.docx
+++ b/backend/app/assets/template_onepager.docx
@@ -713,7 +713,7 @@
     <w:basedOn w:val="Normal"/>
     <w:qFormat/>
     <w:pPr>
-      <w:spacing w:after="42" w:line="222"/>
+      <w:spacing w:after="60" w:line="270" w:lineRule="auto"/>
     </w:pPr>
     <w:rPr>
       <w:sz w:val="16"/>
@@ -742,7 +742,7 @@
     <w:basedOn w:val="Normal"/>
     <w:qFormat/>
     <w:pPr>
-      <w:spacing w:after="0" w:line="222"/>
+      <w:spacing w:after="30" w:line="270" w:lineRule="auto"/>
     </w:pPr>
     <w:rPr>
       <w:sz w:val="16"/>

</xml_diff>